<commit_message>
Apply Acta editorial review [skip acta-editorial-patch]
</commit_message>
<xml_diff>
--- a/publication/Paper_4_Study_8/Acta_Astronautica/ACTA_ASTRONAUTICA_COVER_LETTER.docx
+++ b/publication/Paper_4_Study_8/Acta_Astronautica/ACTA_ASTRONAUTICA_COVER_LETTER.docx
@@ -29,7 +29,7 @@
         <w:keepLines w:val="0"/>
       </w:pPr>
       <w:r>
-        <w:t>Please consider the manuscript "Contact-Aware Cryptographic Agility for Trusted Post-Compromise Recovery in Intermittently Connected Space Systems" for publication as a Research Paper in Acta Astronautica.</w:t>
+        <w:t>Please consider the manuscript "Contact-Aware Cryptographic Agility for Trusted Post-Compromise Recovery in Intermittently Connected Space Systems" for publication in Acta Astronautica.</w:t>
       </w:r>
     </w:p>
     <w:p>
@@ -37,7 +37,7 @@
         <w:keepLines w:val="0"/>
       </w:pPr>
       <w:r>
-        <w:t>The manuscript examines post-compromise cryptographic transition as a deterministic finite space-systems problem under intermittent logical contact. The frozen 3,456-position factorial study jointly varies standardized ML-KEM/ML-DSA object burden, transition policy, logical contact regime, bounded disruption, compromise phase, and recovery deadline. Its prespecified primary policy comparison is negative: contact-aware staged recovery and ordinary staged recovery have exactly the same trusted-recovery success proportion, both marginally and in every prespecified stratum. The paper retains that null result and instead shows how feasibility changes with standardized cryptographic-object burden, contact timing, and deadline, while transition policy redistributes modeled state and availability costs.</w:t>
+        <w:t>The manuscript addresses a recovery problem for long-lived space systems: after predecessor credentials or cryptographic state are compromised, can a successor cryptographic epoch be established and confirmed within finite intermittent-contact opportunities? The frozen deterministic study evaluates 3,456 factorial positions spanning three exact ML-KEM/ML-DSA profiles, four recovery policies, four equal-total-capacity contact regimes, four bounded non-cryptanalytic disruptions, six compromise offsets, and three logical deadlines.</w:t>
       </w:r>
     </w:p>
     <w:p>
@@ -45,7 +45,7 @@
         <w:keepLines w:val="0"/>
       </w:pPr>
       <w:r>
-        <w:t>The contribution is intentionally bounded. The study does not claim onboard cryptographic performance, RF performance, orbital realism, CCSDS approval of an ML-KEM/ML-DSA profile, flight readiness, or operational validation. Logical slots have no physical time conversion. The separately written reference implementation is a same-repository reproducibility check rather than independent external replication.</w:t>
+        <w:t>The prespecified primary comparison is deliberately retained as a null result. Contact-aware staged recovery and ordinary staged recovery achieved the same modeled trusted-recovery success proportion, both overall and in every prespecified stratum. The manuscript therefore does not claim policy superiority. Instead, it shows how standardized cryptographic-object burden, contact timing, and logical deadline condition recovery feasibility, while policy choice redistributes predecessor exposure, control unavailability, dual-epoch overlap, modeled transfer burden, attempts, and failure classification.</w:t>
       </w:r>
     </w:p>
     <w:p>
@@ -53,7 +53,7 @@
         <w:keepLines w:val="0"/>
       </w:pPr>
       <w:r>
-        <w:t>This manuscript reports a deterministic software/modeling study with no human participants, animals, live spacecraft operations, unauthorized access, or RF experimentation. The research received no specific grant from funding agencies in the public, commercial, or not-for-profit sectors. The author declares no competing interests.</w:t>
+        <w:t>The manuscript is well aligned with Acta Astronautica because it treats cryptographic agility as a space-systems design and trusted-recovery problem, situated against current PQC, crypto-agility, satellite cybersecurity, and CCSDS work. The evidence boundary is explicit: the study does not claim onboard cryptographic performance, RF performance, orbital realism, CCSDS approval of an ML-KEM/ML-DSA profile, flight readiness, or operational validation. Logical slots have no physical-time conversion, and the separately implemented reference model is a same-repository reproducibility check rather than external replication.</w:t>
       </w:r>
     </w:p>
     <w:p>
@@ -61,7 +61,7 @@
         <w:keepLines w:val="0"/>
       </w:pPr>
       <w:r>
-        <w:t>Generative-AI language assistance was used during manuscript development and publication-package review, with author review and responsibility retained. No new Study 8 scientific execution or statistical reanalysis was performed during publication preparation.</w:t>
+        <w:t>The complete modeled population, code, and frozen findings are available in a public repository and are bound by recorded SHA-256 values. The study involved no human participants, animals, live spacecraft operations, unauthorized access, or RF experimentation. It received no specific grant from funding agencies in the public, commercial, or not-for-profit sectors, and I declare no competing interests.</w:t>
       </w:r>
     </w:p>
     <w:p>

</xml_diff>

<commit_message>
Refine and refreeze Acta Astronautica Study 8 submission package
Apply the authorized multi-perspective editorial review to the Acta Astronautica Study 8 / Paper 4 submission package and establish S8-ACTA-PKGFREEZE-002. Preserve the frozen publication/study8 science, exact negative primary result, claim boundaries, and freeze-001 history. Exact publisher-facing bytes passed render, accessibility, revision, Unicode-dash, checksum, manifest, repository validation, frozen reproduction, and no-drift checks. Publisher submission and Editorial Manager actions remain unauthorized.
</commit_message>
<xml_diff>
--- a/publication/Paper_4_Study_8/Acta_Astronautica/ACTA_ASTRONAUTICA_COVER_LETTER.docx
+++ b/publication/Paper_4_Study_8/Acta_Astronautica/ACTA_ASTRONAUTICA_COVER_LETTER.docx
@@ -29,7 +29,7 @@
         <w:keepLines w:val="0"/>
       </w:pPr>
       <w:r>
-        <w:t>Please consider the manuscript "Contact-Aware Cryptographic Agility for Trusted Post-Compromise Recovery in Intermittently Connected Space Systems" for publication as a Research Paper in Acta Astronautica.</w:t>
+        <w:t>Please consider the manuscript "Contact-Aware Cryptographic Agility for Trusted Post-Compromise Recovery in Intermittently Connected Space Systems" for publication in Acta Astronautica.</w:t>
       </w:r>
     </w:p>
     <w:p>
@@ -37,7 +37,7 @@
         <w:keepLines w:val="0"/>
       </w:pPr>
       <w:r>
-        <w:t>The manuscript examines post-compromise cryptographic transition as a deterministic finite space-systems problem under intermittent logical contact. The frozen 3,456-position factorial study jointly varies standardized ML-KEM/ML-DSA object burden, transition policy, logical contact regime, bounded disruption, compromise phase, and recovery deadline. Its prespecified primary policy comparison is negative: contact-aware staged recovery and ordinary staged recovery have exactly the same trusted-recovery success proportion, both marginally and in every prespecified stratum. The paper retains that null result and instead shows how feasibility changes with standardized cryptographic-object burden, contact timing, and deadline, while transition policy redistributes modeled state and availability costs.</w:t>
+        <w:t>The manuscript addresses a recovery problem for long-lived space systems: after predecessor credentials or cryptographic state are compromised, can a successor cryptographic epoch be established and confirmed within finite intermittent-contact opportunities? The frozen deterministic study evaluates 3,456 factorial positions spanning three exact ML-KEM/ML-DSA profiles, four recovery policies, four equal-total-capacity contact regimes, four bounded non-cryptanalytic disruptions, six compromise offsets, and three logical deadlines.</w:t>
       </w:r>
     </w:p>
     <w:p>
@@ -45,7 +45,7 @@
         <w:keepLines w:val="0"/>
       </w:pPr>
       <w:r>
-        <w:t>The contribution is intentionally bounded. The study does not claim onboard cryptographic performance, RF performance, orbital realism, CCSDS approval of an ML-KEM/ML-DSA profile, flight readiness, or operational validation. Logical slots have no physical time conversion. The separately written reference implementation is a same-repository reproducibility check rather than independent external replication.</w:t>
+        <w:t>The prespecified primary comparison is deliberately retained as a null result. Contact-aware staged recovery and ordinary staged recovery achieved the same modeled trusted-recovery success proportion, both overall and in every prespecified stratum. The manuscript therefore does not claim policy superiority. Instead, it shows how standardized cryptographic-object burden, contact timing, and logical deadline condition recovery feasibility, while policy choice redistributes predecessor exposure, control unavailability, dual-epoch overlap, modeled transfer burden, attempts, and failure classification.</w:t>
       </w:r>
     </w:p>
     <w:p>
@@ -53,7 +53,7 @@
         <w:keepLines w:val="0"/>
       </w:pPr>
       <w:r>
-        <w:t>This manuscript reports a deterministic software/modeling study with no human participants, animals, live spacecraft operations, unauthorized access, or RF experimentation. The research received no specific grant from funding agencies in the public, commercial, or not-for-profit sectors. The author declares no competing interests.</w:t>
+        <w:t>The manuscript is well aligned with Acta Astronautica because it treats cryptographic agility as a space-systems design and trusted-recovery problem, situated against current PQC, crypto-agility, satellite cybersecurity, and CCSDS work. The evidence boundary is explicit: the study does not claim onboard cryptographic performance, RF performance, orbital realism, CCSDS approval of an ML-KEM/ML-DSA profile, flight readiness, or operational validation. Logical slots have no physical-time conversion, and the separately implemented reference model is a same-repository reproducibility check rather than external replication.</w:t>
       </w:r>
     </w:p>
     <w:p>
@@ -61,7 +61,7 @@
         <w:keepLines w:val="0"/>
       </w:pPr>
       <w:r>
-        <w:t>Generative-AI language assistance was used during manuscript development and publication-package review, with author review and responsibility retained. No new Study 8 scientific execution or statistical reanalysis was performed during publication preparation.</w:t>
+        <w:t>The complete modeled population, code, and frozen findings are available in a public repository and are bound by recorded SHA-256 values. The study involved no human participants, animals, live spacecraft operations, unauthorized access, or RF experimentation. It received no specific grant from funding agencies in the public, commercial, or not-for-profit sectors, and I declare no competing interests.</w:t>
       </w:r>
     </w:p>
     <w:p>

</xml_diff>